<commit_message>
Finalize IJMR round1 citations and embedded figure assets
</commit_message>
<xml_diff>
--- a/projects/india_patient_safety_surveillance/docs/manuscripts/target_journal_packages/ijmr_submission_candidate_round1/01_first_page_file_ijmr_round1.docx
+++ b/projects/india_patient_safety_surveillance/docs/manuscripts/target_journal_packages/ijmr_submission_candidate_round1/01_first_page_file_ijmr_round1.docx
@@ -328,6 +328,12 @@
       </w:r>
       <w:r>
         <w:t xml:space="preserve">Number of figures: 2</w:t>
+      </w:r>
+      <w:r>
+        <w:br/>
+      </w:r>
+      <w:r>
+        <w:t xml:space="preserve">Graphical abstract: 1</w:t>
       </w:r>
     </w:p>
     <w:bookmarkEnd w:id="22"/>

</xml_diff>